<commit_message>
added liquid mass dispense
</commit_message>
<xml_diff>
--- a/Important values.docx
+++ b/Important values.docx
@@ -1831,26 +1831,32 @@
 </file>
 
 <file path=customXml/item1.xml><?xml version="1.0" encoding="utf-8"?>
-<ct:contentTypeSchema xmlns:ct="http://schemas.microsoft.com/office/2006/metadata/contentType" xmlns:ma="http://schemas.microsoft.com/office/2006/metadata/properties/metaAttributes" ct:_="" ma:_="" ma:contentTypeName="Document" ma:contentTypeID="0x010100C181E1C5AF96D14298BF63680C7C5ABA" ma:contentTypeVersion="11" ma:contentTypeDescription="Create a new document." ma:contentTypeScope="" ma:versionID="a2ea71bd11083e28236f37cc0fea4d6c">
-  <xsd:schema xmlns:xsd="http://www.w3.org/2001/XMLSchema" xmlns:xs="http://www.w3.org/2001/XMLSchema" xmlns:p="http://schemas.microsoft.com/office/2006/metadata/properties" xmlns:ns3="4fd51543-988e-47d5-828c-8ef2152254b9" targetNamespace="http://schemas.microsoft.com/office/2006/metadata/properties" ma:root="true" ma:fieldsID="339b1c549c1040d1461440d7de81e6a3" ns3:_="">
-    <xsd:import namespace="4fd51543-988e-47d5-828c-8ef2152254b9"/>
+<ct:contentTypeSchema xmlns:ct="http://schemas.microsoft.com/office/2006/metadata/contentType" xmlns:ma="http://schemas.microsoft.com/office/2006/metadata/properties/metaAttributes" ct:_="" ma:_="" ma:contentTypeName="Document" ma:contentTypeID="0x01010085E7130ED883394FB144BCB9223171D8" ma:contentTypeVersion="16" ma:contentTypeDescription="Create a new document." ma:contentTypeScope="" ma:versionID="c75b2c9d0baddedb5d5c9ac2f1c46d6f">
+  <xsd:schema xmlns:xsd="http://www.w3.org/2001/XMLSchema" xmlns:xs="http://www.w3.org/2001/XMLSchema" xmlns:p="http://schemas.microsoft.com/office/2006/metadata/properties" xmlns:ns2="a3154109-1d0c-437e-b5a5-e7f74c43baaa" xmlns:ns3="73ab24cd-13cc-4967-9ebd-27d2662a6de9" xmlns:ns4="efce84db-8738-4c7b-9bdc-65b9500871f6" targetNamespace="http://schemas.microsoft.com/office/2006/metadata/properties" ma:root="true" ma:fieldsID="d8c4dbb9606f2bd0ab8e2b49684024ea" ns2:_="" ns3:_="" ns4:_="">
+    <xsd:import namespace="a3154109-1d0c-437e-b5a5-e7f74c43baaa"/>
+    <xsd:import namespace="73ab24cd-13cc-4967-9ebd-27d2662a6de9"/>
+    <xsd:import namespace="efce84db-8738-4c7b-9bdc-65b9500871f6"/>
     <xsd:element name="properties">
       <xsd:complexType>
         <xsd:sequence>
           <xsd:element name="documentManagement">
             <xsd:complexType>
               <xsd:all>
-                <xsd:element ref="ns3:MediaServiceMetadata" minOccurs="0"/>
-                <xsd:element ref="ns3:MediaServiceFastMetadata" minOccurs="0"/>
-                <xsd:element ref="ns3:MediaServiceObjectDetectorVersions" minOccurs="0"/>
-                <xsd:element ref="ns3:MediaServiceSearchProperties" minOccurs="0"/>
-                <xsd:element ref="ns3:MediaServiceDateTaken" minOccurs="0"/>
-                <xsd:element ref="ns3:_activity" minOccurs="0"/>
-                <xsd:element ref="ns3:MediaServiceSystemTags" minOccurs="0"/>
-                <xsd:element ref="ns3:MediaServiceOCR" minOccurs="0"/>
-                <xsd:element ref="ns3:MediaServiceGenerationTime" minOccurs="0"/>
-                <xsd:element ref="ns3:MediaServiceEventHashCode" minOccurs="0"/>
-                <xsd:element ref="ns3:MediaServiceLocation" minOccurs="0"/>
+                <xsd:element ref="ns2:MediaServiceMetadata" minOccurs="0"/>
+                <xsd:element ref="ns2:MediaServiceFastMetadata" minOccurs="0"/>
+                <xsd:element ref="ns3:SharedWithUsers" minOccurs="0"/>
+                <xsd:element ref="ns3:SharedWithDetails" minOccurs="0"/>
+                <xsd:element ref="ns2:lcf76f155ced4ddcb4097134ff3c332f" minOccurs="0"/>
+                <xsd:element ref="ns4:TaxCatchAll" minOccurs="0"/>
+                <xsd:element ref="ns2:MediaServiceOCR" minOccurs="0"/>
+                <xsd:element ref="ns2:MediaServiceGenerationTime" minOccurs="0"/>
+                <xsd:element ref="ns2:MediaServiceEventHashCode" minOccurs="0"/>
+                <xsd:element ref="ns2:MediaServiceDateTaken" minOccurs="0"/>
+                <xsd:element ref="ns2:MediaServiceObjectDetectorVersions" minOccurs="0"/>
+                <xsd:element ref="ns2:MediaLengthInSeconds" minOccurs="0"/>
+                <xsd:element ref="ns2:MediaServiceSearchProperties" minOccurs="0"/>
+                <xsd:element ref="ns2:MediaServiceBillingMetadata" minOccurs="0"/>
+                <xsd:element ref="ns2:MediaServiceLocation" minOccurs="0"/>
               </xsd:all>
             </xsd:complexType>
           </xsd:element>
@@ -1858,7 +1864,7 @@
       </xsd:complexType>
     </xsd:element>
   </xsd:schema>
-  <xsd:schema xmlns:xsd="http://www.w3.org/2001/XMLSchema" xmlns:xs="http://www.w3.org/2001/XMLSchema" xmlns:dms="http://schemas.microsoft.com/office/2006/documentManagement/types" xmlns:pc="http://schemas.microsoft.com/office/infopath/2007/PartnerControls" targetNamespace="4fd51543-988e-47d5-828c-8ef2152254b9" elementFormDefault="qualified">
+  <xsd:schema xmlns:xsd="http://www.w3.org/2001/XMLSchema" xmlns:xs="http://www.w3.org/2001/XMLSchema" xmlns:dms="http://schemas.microsoft.com/office/2006/documentManagement/types" xmlns:pc="http://schemas.microsoft.com/office/infopath/2007/PartnerControls" targetNamespace="a3154109-1d0c-437e-b5a5-e7f74c43baaa" elementFormDefault="qualified">
     <xsd:import namespace="http://schemas.microsoft.com/office/2006/documentManagement/types"/>
     <xsd:import namespace="http://schemas.microsoft.com/office/infopath/2007/PartnerControls"/>
     <xsd:element name="MediaServiceMetadata" ma:index="8" nillable="true" ma:displayName="MediaServiceMetadata" ma:hidden="true" ma:internalName="MediaServiceMetadata" ma:readOnly="true">
@@ -1871,30 +1877,12 @@
         <xsd:restriction base="dms:Note"/>
       </xsd:simpleType>
     </xsd:element>
-    <xsd:element name="MediaServiceObjectDetectorVersions" ma:index="10" nillable="true" ma:displayName="MediaServiceObjectDetectorVersions" ma:hidden="true" ma:indexed="true" ma:internalName="MediaServiceObjectDetectorVersions" ma:readOnly="true">
-      <xsd:simpleType>
-        <xsd:restriction base="dms:Text"/>
-      </xsd:simpleType>
-    </xsd:element>
-    <xsd:element name="MediaServiceSearchProperties" ma:index="11" nillable="true" ma:displayName="MediaServiceSearchProperties" ma:hidden="true" ma:internalName="MediaServiceSearchProperties" ma:readOnly="true">
-      <xsd:simpleType>
-        <xsd:restriction base="dms:Note"/>
-      </xsd:simpleType>
-    </xsd:element>
-    <xsd:element name="MediaServiceDateTaken" ma:index="12" nillable="true" ma:displayName="MediaServiceDateTaken" ma:hidden="true" ma:indexed="true" ma:internalName="MediaServiceDateTaken" ma:readOnly="true">
-      <xsd:simpleType>
-        <xsd:restriction base="dms:Text"/>
-      </xsd:simpleType>
-    </xsd:element>
-    <xsd:element name="_activity" ma:index="13" nillable="true" ma:displayName="_activity" ma:hidden="true" ma:internalName="_activity">
-      <xsd:simpleType>
-        <xsd:restriction base="dms:Note"/>
-      </xsd:simpleType>
-    </xsd:element>
-    <xsd:element name="MediaServiceSystemTags" ma:index="14" nillable="true" ma:displayName="MediaServiceSystemTags" ma:hidden="true" ma:internalName="MediaServiceSystemTags" ma:readOnly="true">
-      <xsd:simpleType>
-        <xsd:restriction base="dms:Note"/>
-      </xsd:simpleType>
+    <xsd:element name="lcf76f155ced4ddcb4097134ff3c332f" ma:index="13" nillable="true" ma:taxonomy="true" ma:internalName="lcf76f155ced4ddcb4097134ff3c332f" ma:taxonomyFieldName="MediaServiceImageTags" ma:displayName="Image Tags" ma:readOnly="false" ma:fieldId="{5cf76f15-5ced-4ddc-b409-7134ff3c332f}" ma:taxonomyMulti="true" ma:sspId="c2d55d72-5afa-45f9-90b6-e0708aeee9a0" ma:termSetId="09814cd3-568e-fe90-9814-8d621ff8fb84" ma:anchorId="fba54fb3-c3e1-fe81-a776-ca4b69148c4d" ma:open="true" ma:isKeyword="false">
+      <xsd:complexType>
+        <xsd:sequence>
+          <xsd:element ref="pc:Terms" minOccurs="0" maxOccurs="1"/>
+        </xsd:sequence>
+      </xsd:complexType>
     </xsd:element>
     <xsd:element name="MediaServiceOCR" ma:index="15" nillable="true" ma:displayName="Extracted Text" ma:internalName="MediaServiceOCR" ma:readOnly="true">
       <xsd:simpleType>
@@ -1913,10 +1901,80 @@
         <xsd:restriction base="dms:Text"/>
       </xsd:simpleType>
     </xsd:element>
-    <xsd:element name="MediaServiceLocation" ma:index="18" nillable="true" ma:displayName="Location" ma:indexed="true" ma:internalName="MediaServiceLocation" ma:readOnly="true">
+    <xsd:element name="MediaServiceDateTaken" ma:index="18" nillable="true" ma:displayName="MediaServiceDateTaken" ma:hidden="true" ma:indexed="true" ma:internalName="MediaServiceDateTaken" ma:readOnly="true">
       <xsd:simpleType>
         <xsd:restriction base="dms:Text"/>
       </xsd:simpleType>
+    </xsd:element>
+    <xsd:element name="MediaServiceObjectDetectorVersions" ma:index="19" nillable="true" ma:displayName="MediaServiceObjectDetectorVersions" ma:hidden="true" ma:indexed="true" ma:internalName="MediaServiceObjectDetectorVersions" ma:readOnly="true">
+      <xsd:simpleType>
+        <xsd:restriction base="dms:Text"/>
+      </xsd:simpleType>
+    </xsd:element>
+    <xsd:element name="MediaLengthInSeconds" ma:index="20" nillable="true" ma:displayName="MediaLengthInSeconds" ma:hidden="true" ma:internalName="MediaLengthInSeconds" ma:readOnly="true">
+      <xsd:simpleType>
+        <xsd:restriction base="dms:Unknown"/>
+      </xsd:simpleType>
+    </xsd:element>
+    <xsd:element name="MediaServiceSearchProperties" ma:index="21" nillable="true" ma:displayName="MediaServiceSearchProperties" ma:hidden="true" ma:internalName="MediaServiceSearchProperties" ma:readOnly="true">
+      <xsd:simpleType>
+        <xsd:restriction base="dms:Note"/>
+      </xsd:simpleType>
+    </xsd:element>
+    <xsd:element name="MediaServiceBillingMetadata" ma:index="22" nillable="true" ma:displayName="MediaServiceBillingMetadata" ma:hidden="true" ma:internalName="MediaServiceBillingMetadata" ma:readOnly="true">
+      <xsd:simpleType>
+        <xsd:restriction base="dms:Note"/>
+      </xsd:simpleType>
+    </xsd:element>
+    <xsd:element name="MediaServiceLocation" ma:index="23" nillable="true" ma:displayName="Location" ma:description="" ma:indexed="true" ma:internalName="MediaServiceLocation" ma:readOnly="true">
+      <xsd:simpleType>
+        <xsd:restriction base="dms:Text"/>
+      </xsd:simpleType>
+    </xsd:element>
+  </xsd:schema>
+  <xsd:schema xmlns:xsd="http://www.w3.org/2001/XMLSchema" xmlns:xs="http://www.w3.org/2001/XMLSchema" xmlns:dms="http://schemas.microsoft.com/office/2006/documentManagement/types" xmlns:pc="http://schemas.microsoft.com/office/infopath/2007/PartnerControls" targetNamespace="73ab24cd-13cc-4967-9ebd-27d2662a6de9" elementFormDefault="qualified">
+    <xsd:import namespace="http://schemas.microsoft.com/office/2006/documentManagement/types"/>
+    <xsd:import namespace="http://schemas.microsoft.com/office/infopath/2007/PartnerControls"/>
+    <xsd:element name="SharedWithUsers" ma:index="10" nillable="true" ma:displayName="Shared With" ma:internalName="SharedWithUsers" ma:readOnly="true">
+      <xsd:complexType>
+        <xsd:complexContent>
+          <xsd:extension base="dms:UserMulti">
+            <xsd:sequence>
+              <xsd:element name="UserInfo" minOccurs="0" maxOccurs="unbounded">
+                <xsd:complexType>
+                  <xsd:sequence>
+                    <xsd:element name="DisplayName" type="xsd:string" minOccurs="0"/>
+                    <xsd:element name="AccountId" type="dms:UserId" minOccurs="0" nillable="true"/>
+                    <xsd:element name="AccountType" type="xsd:string" minOccurs="0"/>
+                  </xsd:sequence>
+                </xsd:complexType>
+              </xsd:element>
+            </xsd:sequence>
+          </xsd:extension>
+        </xsd:complexContent>
+      </xsd:complexType>
+    </xsd:element>
+    <xsd:element name="SharedWithDetails" ma:index="11" nillable="true" ma:displayName="Shared With Details" ma:internalName="SharedWithDetails" ma:readOnly="true">
+      <xsd:simpleType>
+        <xsd:restriction base="dms:Note">
+          <xsd:maxLength value="255"/>
+        </xsd:restriction>
+      </xsd:simpleType>
+    </xsd:element>
+  </xsd:schema>
+  <xsd:schema xmlns:xsd="http://www.w3.org/2001/XMLSchema" xmlns:xs="http://www.w3.org/2001/XMLSchema" xmlns:dms="http://schemas.microsoft.com/office/2006/documentManagement/types" xmlns:pc="http://schemas.microsoft.com/office/infopath/2007/PartnerControls" targetNamespace="efce84db-8738-4c7b-9bdc-65b9500871f6" elementFormDefault="qualified">
+    <xsd:import namespace="http://schemas.microsoft.com/office/2006/documentManagement/types"/>
+    <xsd:import namespace="http://schemas.microsoft.com/office/infopath/2007/PartnerControls"/>
+    <xsd:element name="TaxCatchAll" ma:index="14" nillable="true" ma:displayName="Taxonomy Catch All Column" ma:hidden="true" ma:list="{51645941-b371-4c8e-94e2-de0bc4e067f8}" ma:internalName="TaxCatchAll" ma:showField="CatchAllData" ma:web="73ab24cd-13cc-4967-9ebd-27d2662a6de9">
+      <xsd:complexType>
+        <xsd:complexContent>
+          <xsd:extension base="dms:MultiChoiceLookup">
+            <xsd:sequence>
+              <xsd:element name="Value" type="dms:Lookup" maxOccurs="unbounded" minOccurs="0" nillable="true"/>
+            </xsd:sequence>
+          </xsd:extension>
+        </xsd:complexContent>
+      </xsd:complexType>
     </xsd:element>
   </xsd:schema>
   <xsd:schema xmlns="http://schemas.openxmlformats.org/package/2006/metadata/core-properties" xmlns:xsd="http://www.w3.org/2001/XMLSchema" xmlns:xsi="http://www.w3.org/2001/XMLSchema-instance" xmlns:dc="http://purl.org/dc/elements/1.1/" xmlns:dcterms="http://purl.org/dc/terms/" xmlns:odoc="http://schemas.microsoft.com/internal/obd" targetNamespace="http://schemas.openxmlformats.org/package/2006/metadata/core-properties" elementFormDefault="qualified" attributeFormDefault="unqualified" blockDefault="#all">
@@ -2030,27 +2088,16 @@
 <file path=customXml/item3.xml><?xml version="1.0" encoding="utf-8"?>
 <p:properties xmlns:p="http://schemas.microsoft.com/office/2006/metadata/properties" xmlns:xsi="http://www.w3.org/2001/XMLSchema-instance" xmlns:pc="http://schemas.microsoft.com/office/infopath/2007/PartnerControls">
   <documentManagement>
-    <_activity xmlns="4fd51543-988e-47d5-828c-8ef2152254b9" xsi:nil="true"/>
+    <TaxCatchAll xmlns="efce84db-8738-4c7b-9bdc-65b9500871f6" xsi:nil="true"/>
+    <lcf76f155ced4ddcb4097134ff3c332f xmlns="a3154109-1d0c-437e-b5a5-e7f74c43baaa">
+      <Terms xmlns="http://schemas.microsoft.com/office/infopath/2007/PartnerControls"/>
+    </lcf76f155ced4ddcb4097134ff3c332f>
   </documentManagement>
 </p:properties>
 </file>
 
 <file path=customXml/itemProps1.xml><?xml version="1.0" encoding="utf-8"?>
-<ds:datastoreItem xmlns:ds="http://schemas.openxmlformats.org/officeDocument/2006/customXml" ds:itemID="{E1267209-689D-4291-A641-8F0C8AE3760A}">
-  <ds:schemaRefs>
-    <ds:schemaRef ds:uri="http://schemas.microsoft.com/office/2006/metadata/contentType"/>
-    <ds:schemaRef ds:uri="http://schemas.microsoft.com/office/2006/metadata/properties/metaAttributes"/>
-    <ds:schemaRef ds:uri="http://www.w3.org/2001/XMLSchema"/>
-    <ds:schemaRef ds:uri="http://schemas.microsoft.com/office/2006/metadata/properties"/>
-    <ds:schemaRef ds:uri="4fd51543-988e-47d5-828c-8ef2152254b9"/>
-    <ds:schemaRef ds:uri="http://schemas.microsoft.com/office/2006/documentManagement/types"/>
-    <ds:schemaRef ds:uri="http://schemas.microsoft.com/office/infopath/2007/PartnerControls"/>
-    <ds:schemaRef ds:uri="http://schemas.openxmlformats.org/package/2006/metadata/core-properties"/>
-    <ds:schemaRef ds:uri="http://purl.org/dc/elements/1.1/"/>
-    <ds:schemaRef ds:uri="http://purl.org/dc/terms/"/>
-    <ds:schemaRef ds:uri="http://schemas.microsoft.com/internal/obd"/>
-  </ds:schemaRefs>
-</ds:datastoreItem>
+<ds:datastoreItem xmlns:ds="http://schemas.openxmlformats.org/officeDocument/2006/customXml" ds:itemID="{34CF644F-3F3E-45E2-B128-A4E8837A9608}"/>
 </file>
 
 <file path=customXml/itemProps2.xml><?xml version="1.0" encoding="utf-8"?>

</xml_diff>